<commit_message>
refactor: unify ABET assessment rubrics and structure educational resources in burger_delivery
</commit_message>
<xml_diff>
--- a/education/guias_laboratorio/GUIA_LAB_01_RED_ROS2_TALKER_LISTENER.docx
+++ b/education/guias_laboratorio/GUIA_LAB_01_RED_ROS2_TALKER_LISTENER.docx
@@ -347,7 +347,7 @@
                 <w:b/>
                 <w:sz w:val="18"/>
               </w:rPr>
-              <w:t>Laboratorio de: Robótica Aplicada / Robótica con ROS 2</w:t>
+              <w:t>Laboratorio de: ROBOT OPERATING SYSTEM - ROS</w:t>
             </w:r>
           </w:p>
         </w:tc>
@@ -1768,7 +1768,7 @@
           <w:rFonts w:ascii="Arial" w:hAnsi="Arial"/>
           <w:sz w:val="18"/>
         </w:rPr>
-        <w:t>Robótica Aplicada con ROS 2 Experimental</w:t>
+        <w:t>ROBOT OPERATING SYSTEM - ROS</w:t>
       </w:r>
     </w:p>
     <w:p>
@@ -9737,7 +9737,7 @@
           <w:i w:val="0"/>
           <w:sz w:val="18"/>
         </w:rPr>
-        <w:t>4. Roncancio, H. (2026). Syllabus y Guía Técnica de Robótica Aplicada con ROS 2. Universidad Militar Nueva Granada.</w:t>
+        <w:t>4. Roncancio, H. (2026). Syllabus y Guía Técnica de ROBOT OPERATING SYSTEM - ROS. Universidad Militar Nueva Granada.</w:t>
       </w:r>
     </w:p>
     <w:tbl>

</xml_diff>